<commit_message>
Disclose generative-AI use, as F1000's policy requires
The submission asks authors to confirm that any use of generative AI is
disclosed in the manuscript itself, naming the tool and version, how it was
used, and why. Claude was used substantially here -- drafting prose including
the related-work comparison, restating the readership analysis after the
GA4 scoping error surfaced, and checking the manuscript against the journal's
guidelines -- and the manuscript said nothing about it. Ticking that box
without this section would have been a false declaration.

States plainly that the figures come from the archived data via the included
script, that the authors verified every claim and citation against primary
sources and are responsible for the content, and that generative AI is not an
author.
</commit_message>
<xml_diff>
--- a/paper/paper-f1000.docx
+++ b/paper/paper-f1000.docx
@@ -2205,12 +2205,87 @@
       </w:r>
     </w:p>
     <w:bookmarkEnd w:id="26"/>
-    <w:bookmarkStart w:id="27" w:name="competing-interests"/>
+    <w:bookmarkStart w:id="27" w:name="use-of-generative-ai"/>
     <w:p>
       <w:pPr>
         <w:pStyle w:val="Heading1"/>
       </w:pPr>
       <w:r>
+        <w:t xml:space="preserve">Use of generative AI</w:t>
+      </w:r>
+    </w:p>
+    <w:p>
+      <w:pPr>
+        <w:pStyle w:val="FirstParagraph"/>
+      </w:pPr>
+      <w:r>
+        <w:t xml:space="preserve">Claude (Anthropic; Opus 4.8 and Fable 5) was used in preparing this manuscript:</w:t>
+      </w:r>
+      <w:r>
+        <w:t xml:space="preserve"> </w:t>
+      </w:r>
+      <w:r>
+        <w:t xml:space="preserve">drafting and revising prose, including the comparison to existing resources;</w:t>
+      </w:r>
+      <w:r>
+        <w:t xml:space="preserve"> </w:t>
+      </w:r>
+      <w:r>
+        <w:t xml:space="preserve">restating the readership analysis after a scoping error in the underlying</w:t>
+      </w:r>
+      <w:r>
+        <w:t xml:space="preserve"> </w:t>
+      </w:r>
+      <w:r>
+        <w:t xml:space="preserve">Google Analytics 4 export was identified; and reviewing the manuscript against</w:t>
+      </w:r>
+      <w:r>
+        <w:t xml:space="preserve"> </w:t>
+      </w:r>
+      <w:r>
+        <w:t xml:space="preserve">this journal’s article guidelines. All reported figures were computed from the</w:t>
+      </w:r>
+      <w:r>
+        <w:t xml:space="preserve"> </w:t>
+      </w:r>
+      <w:r>
+        <w:t xml:space="preserve">archived data by the script provided (</w:t>
+      </w:r>
+      <w:r>
+        <w:rPr>
+          <w:rStyle w:val="VerbatimChar"/>
+        </w:rPr>
+        <w:t xml:space="preserve">paper/ga4_pull.py</w:t>
+      </w:r>
+      <w:r>
+        <w:t xml:space="preserve">), and every claim and</w:t>
+      </w:r>
+      <w:r>
+        <w:t xml:space="preserve"> </w:t>
+      </w:r>
+      <w:r>
+        <w:t xml:space="preserve">citation was verified against primary sources by the authors, who take full</w:t>
+      </w:r>
+      <w:r>
+        <w:t xml:space="preserve"> </w:t>
+      </w:r>
+      <w:r>
+        <w:t xml:space="preserve">responsibility for the content of this article. Generative AI is not an author</w:t>
+      </w:r>
+      <w:r>
+        <w:t xml:space="preserve"> </w:t>
+      </w:r>
+      <w:r>
+        <w:t xml:space="preserve">and does not meet authorship criteria.</w:t>
+      </w:r>
+    </w:p>
+    <w:bookmarkEnd w:id="27"/>
+    <w:bookmarkStart w:id="28" w:name="competing-interests"/>
+    <w:p>
+      <w:pPr>
+        <w:pStyle w:val="Heading1"/>
+      </w:pPr>
+      <w:r>
         <w:t xml:space="preserve">Competing interests</w:t>
       </w:r>
     </w:p>
@@ -2222,8 +2297,8 @@
         <w:t xml:space="preserve">No competing interests were disclosed.</w:t>
       </w:r>
     </w:p>
-    <w:bookmarkEnd w:id="27"/>
-    <w:bookmarkStart w:id="28" w:name="grant-information"/>
+    <w:bookmarkEnd w:id="28"/>
+    <w:bookmarkStart w:id="29" w:name="grant-information"/>
     <w:p>
       <w:pPr>
         <w:pStyle w:val="Heading1"/>
@@ -2252,8 +2327,8 @@
         <w:t xml:space="preserve">Bioconductor U24 award (U24 CA289073).</w:t>
       </w:r>
     </w:p>
-    <w:bookmarkEnd w:id="28"/>
-    <w:bookmarkStart w:id="29" w:name="acknowledgements"/>
+    <w:bookmarkEnd w:id="29"/>
+    <w:bookmarkStart w:id="30" w:name="acknowledgements"/>
     <w:p>
       <w:pPr>
         <w:pStyle w:val="Heading1"/>
@@ -2355,8 +2430,8 @@
         <w:t xml:space="preserve">page.</w:t>
       </w:r>
     </w:p>
-    <w:bookmarkEnd w:id="29"/>
-    <w:bookmarkStart w:id="52" w:name="references"/>
+    <w:bookmarkEnd w:id="30"/>
+    <w:bookmarkStart w:id="53" w:name="references"/>
     <w:p>
       <w:pPr>
         <w:pStyle w:val="Heading1"/>
@@ -2365,8 +2440,8 @@
         <w:t xml:space="preserve">References</w:t>
       </w:r>
     </w:p>
-    <w:bookmarkStart w:id="51" w:name="refs"/>
-    <w:bookmarkStart w:id="31" w:name="ref-quarto2024"/>
+    <w:bookmarkStart w:id="52" w:name="refs"/>
+    <w:bookmarkStart w:id="32" w:name="ref-quarto2024"/>
     <w:p>
       <w:pPr>
         <w:pStyle w:val="Bibliography"/>
@@ -2383,7 +2458,7 @@
       <w:r>
         <w:t xml:space="preserve"> </w:t>
       </w:r>
-      <w:hyperlink r:id="rId30">
+      <w:hyperlink r:id="rId31">
         <w:r>
           <w:rPr>
             <w:rStyle w:val="Hyperlink"/>
@@ -2395,8 +2470,8 @@
         <w:t xml:space="preserve">.</w:t>
       </w:r>
     </w:p>
-    <w:bookmarkEnd w:id="31"/>
-    <w:bookmarkStart w:id="33" w:name="ref-amezquita2020"/>
+    <w:bookmarkEnd w:id="32"/>
+    <w:bookmarkStart w:id="34" w:name="ref-amezquita2020"/>
     <w:p>
       <w:pPr>
         <w:pStyle w:val="Bibliography"/>
@@ -2438,7 +2513,7 @@
       <w:r>
         <w:t xml:space="preserve"> </w:t>
       </w:r>
-      <w:hyperlink r:id="rId32">
+      <w:hyperlink r:id="rId33">
         <w:r>
           <w:rPr>
             <w:rStyle w:val="Hyperlink"/>
@@ -2450,8 +2525,8 @@
         <w:t xml:space="preserve">.</w:t>
       </w:r>
     </w:p>
-    <w:bookmarkEnd w:id="33"/>
-    <w:bookmarkStart w:id="35" w:name="ref-biocteaching2025"/>
+    <w:bookmarkEnd w:id="34"/>
+    <w:bookmarkStart w:id="36" w:name="ref-biocteaching2025"/>
     <w:p>
       <w:pPr>
         <w:pStyle w:val="Bibliography"/>
@@ -2493,7 +2568,7 @@
       <w:r>
         <w:t xml:space="preserve"> </w:t>
       </w:r>
-      <w:hyperlink r:id="rId34">
+      <w:hyperlink r:id="rId35">
         <w:r>
           <w:rPr>
             <w:rStyle w:val="Hyperlink"/>
@@ -2505,8 +2580,8 @@
         <w:t xml:space="preserve">.</w:t>
       </w:r>
     </w:p>
-    <w:bookmarkEnd w:id="35"/>
-    <w:bookmarkStart w:id="37" w:name="ref-holmes2019msmb"/>
+    <w:bookmarkEnd w:id="36"/>
+    <w:bookmarkStart w:id="38" w:name="ref-holmes2019msmb"/>
     <w:p>
       <w:pPr>
         <w:pStyle w:val="Bibliography"/>
@@ -2530,7 +2605,7 @@
       <w:r>
         <w:t xml:space="preserve"> </w:t>
       </w:r>
-      <w:hyperlink r:id="rId36">
+      <w:hyperlink r:id="rId37">
         <w:r>
           <w:rPr>
             <w:rStyle w:val="Hyperlink"/>
@@ -2542,8 +2617,8 @@
         <w:t xml:space="preserve">.</w:t>
       </w:r>
     </w:p>
-    <w:bookmarkEnd w:id="37"/>
-    <w:bookmarkStart w:id="39" w:name="ref-huber2015"/>
+    <w:bookmarkEnd w:id="38"/>
+    <w:bookmarkStart w:id="40" w:name="ref-huber2015"/>
     <w:p>
       <w:pPr>
         <w:pStyle w:val="Bibliography"/>
@@ -2585,7 +2660,7 @@
       <w:r>
         <w:t xml:space="preserve"> </w:t>
       </w:r>
-      <w:hyperlink r:id="rId38">
+      <w:hyperlink r:id="rId39">
         <w:r>
           <w:rPr>
             <w:rStyle w:val="Hyperlink"/>
@@ -2597,8 +2672,8 @@
         <w:t xml:space="preserve">.</w:t>
       </w:r>
     </w:p>
-    <w:bookmarkEnd w:id="39"/>
-    <w:bookmarkStart w:id="40" w:name="ref-knowles2015adult"/>
+    <w:bookmarkEnd w:id="40"/>
+    <w:bookmarkStart w:id="41" w:name="ref-knowles2015adult"/>
     <w:p>
       <w:pPr>
         <w:pStyle w:val="Bibliography"/>
@@ -2620,8 +2695,8 @@
         <w:t xml:space="preserve">. 8th ed. Routledge.</w:t>
       </w:r>
     </w:p>
-    <w:bookmarkEnd w:id="40"/>
-    <w:bookmarkStart w:id="42" w:name="ref-lawrence2013"/>
+    <w:bookmarkEnd w:id="41"/>
+    <w:bookmarkStart w:id="43" w:name="ref-lawrence2013"/>
     <w:p>
       <w:pPr>
         <w:pStyle w:val="Bibliography"/>
@@ -2654,7 +2729,7 @@
       <w:r>
         <w:t xml:space="preserve"> </w:t>
       </w:r>
-      <w:hyperlink r:id="rId41">
+      <w:hyperlink r:id="rId42">
         <w:r>
           <w:rPr>
             <w:rStyle w:val="Hyperlink"/>
@@ -2666,8 +2741,8 @@
         <w:t xml:space="preserve">.</w:t>
       </w:r>
     </w:p>
-    <w:bookmarkEnd w:id="42"/>
-    <w:bookmarkStart w:id="44" w:name="ref-rcore2024"/>
+    <w:bookmarkEnd w:id="43"/>
+    <w:bookmarkStart w:id="45" w:name="ref-rcore2024"/>
     <w:p>
       <w:pPr>
         <w:pStyle w:val="Bibliography"/>
@@ -2690,7 +2765,7 @@
       <w:r>
         <w:t xml:space="preserve"> </w:t>
       </w:r>
-      <w:hyperlink r:id="rId43">
+      <w:hyperlink r:id="rId44">
         <w:r>
           <w:rPr>
             <w:rStyle w:val="Hyperlink"/>
@@ -2702,8 +2777,8 @@
         <w:t xml:space="preserve">.</w:t>
       </w:r>
     </w:p>
-    <w:bookmarkEnd w:id="44"/>
-    <w:bookmarkStart w:id="46" w:name="ref-wickham2016ggplot2"/>
+    <w:bookmarkEnd w:id="45"/>
+    <w:bookmarkStart w:id="47" w:name="ref-wickham2016ggplot2"/>
     <w:p>
       <w:pPr>
         <w:pStyle w:val="Bibliography"/>
@@ -2727,7 +2802,7 @@
       <w:r>
         <w:t xml:space="preserve"> </w:t>
       </w:r>
-      <w:hyperlink r:id="rId45">
+      <w:hyperlink r:id="rId46">
         <w:r>
           <w:rPr>
             <w:rStyle w:val="Hyperlink"/>
@@ -2739,8 +2814,8 @@
         <w:t xml:space="preserve">.</w:t>
       </w:r>
     </w:p>
-    <w:bookmarkEnd w:id="46"/>
-    <w:bookmarkStart w:id="48" w:name="ref-tidyverse2019"/>
+    <w:bookmarkEnd w:id="47"/>
+    <w:bookmarkStart w:id="49" w:name="ref-tidyverse2019"/>
     <w:p>
       <w:pPr>
         <w:pStyle w:val="Bibliography"/>
@@ -2782,7 +2857,7 @@
       <w:r>
         <w:t xml:space="preserve"> </w:t>
       </w:r>
-      <w:hyperlink r:id="rId47">
+      <w:hyperlink r:id="rId48">
         <w:r>
           <w:rPr>
             <w:rStyle w:val="Hyperlink"/>
@@ -2794,8 +2869,8 @@
         <w:t xml:space="preserve">.</w:t>
       </w:r>
     </w:p>
-    <w:bookmarkEnd w:id="48"/>
-    <w:bookmarkStart w:id="50" w:name="ref-wickham2023r4ds"/>
+    <w:bookmarkEnd w:id="49"/>
+    <w:bookmarkStart w:id="51" w:name="ref-wickham2023r4ds"/>
     <w:p>
       <w:pPr>
         <w:pStyle w:val="Bibliography"/>
@@ -2819,7 +2894,7 @@
       <w:r>
         <w:t xml:space="preserve"> </w:t>
       </w:r>
-      <w:hyperlink r:id="rId49">
+      <w:hyperlink r:id="rId50">
         <w:r>
           <w:rPr>
             <w:rStyle w:val="Hyperlink"/>
@@ -2831,9 +2906,9 @@
         <w:t xml:space="preserve">.</w:t>
       </w:r>
     </w:p>
-    <w:bookmarkEnd w:id="50"/>
     <w:bookmarkEnd w:id="51"/>
     <w:bookmarkEnd w:id="52"/>
+    <w:bookmarkEnd w:id="53"/>
     <w:sectPr>
       <w:footnotePr>
         <w:numRestart w:val="eachSect"/>

</xml_diff>